<commit_message>
Add abdomen-pelvis topics and refresh TOC
</commit_message>
<xml_diff>
--- a/www/content/abdomen-pelvis/Gall bladder and cystic duct.docx
+++ b/www/content/abdomen-pelvis/Gall bladder and cystic duct.docx
@@ -38,7 +38,19 @@
       </w:r>
       <w:proofErr w:type="spellEnd"/>
       <w:r>
-        <w:t xml:space="preserve"> segments - 4B and 5</w:t>
+        <w:t xml:space="preserve"> segments </w:t>
+      </w:r>
+      <w:r>
+        <w:t>–</w:t>
+      </w:r>
+      <w:r>
+        <w:t xml:space="preserve"> 4</w:t>
+      </w:r>
+      <w:r>
+        <w:t>b</w:t>
+      </w:r>
+      <w:r>
+        <w:t xml:space="preserve"> and 5</w:t>
       </w:r>
     </w:p>
     <w:p>
@@ -112,7 +124,7 @@
         </w:rPr>
         <w:lastRenderedPageBreak/>
         <w:drawing>
-          <wp:inline distT="0" distB="0" distL="0" distR="0" wp14:anchorId="5FEC77E0" wp14:editId="5E278E94">
+          <wp:inline distT="0" distB="0" distL="0" distR="0" wp14:anchorId="5FEC77E0" wp14:editId="61A5A76D">
             <wp:extent cx="5731510" cy="3604260"/>
             <wp:effectExtent l="0" t="0" r="0" b="0"/>
             <wp:docPr id="597635238" name="Picture 1" descr="Background image"/>
@@ -389,61 +401,7 @@
         <w:t>Gall stone may lodge here</w:t>
       </w:r>
     </w:p>
-    <w:p>
-      <w:r>
-        <w:rPr>
-          <w:noProof/>
-        </w:rPr>
-        <w:drawing>
-          <wp:inline distT="0" distB="0" distL="0" distR="0" wp14:anchorId="1B95DCF3" wp14:editId="7C4E2D2A">
-            <wp:extent cx="5731510" cy="3700780"/>
-            <wp:effectExtent l="0" t="0" r="0" b="0"/>
-            <wp:docPr id="633295403" name="Picture 2" descr="Background image"/>
-            <wp:cNvGraphicFramePr>
-              <a:graphicFrameLocks xmlns:a="http://schemas.openxmlformats.org/drawingml/2006/main" noChangeAspect="1"/>
-            </wp:cNvGraphicFramePr>
-            <a:graphic xmlns:a="http://schemas.openxmlformats.org/drawingml/2006/main">
-              <a:graphicData uri="http://schemas.openxmlformats.org/drawingml/2006/picture">
-                <pic:pic xmlns:pic="http://schemas.openxmlformats.org/drawingml/2006/picture">
-                  <pic:nvPicPr>
-                    <pic:cNvPr id="0" name="Picture 21" descr="Background image"/>
-                    <pic:cNvPicPr>
-                      <a:picLocks noChangeAspect="1" noChangeArrowheads="1"/>
-                    </pic:cNvPicPr>
-                  </pic:nvPicPr>
-                  <pic:blipFill>
-                    <a:blip r:embed="rId6" cstate="print">
-                      <a:extLst>
-                        <a:ext uri="{28A0092B-C50C-407E-A947-70E740481C1C}">
-                          <a14:useLocalDpi xmlns:a14="http://schemas.microsoft.com/office/drawing/2010/main" val="0"/>
-                        </a:ext>
-                      </a:extLst>
-                    </a:blip>
-                    <a:srcRect/>
-                    <a:stretch>
-                      <a:fillRect/>
-                    </a:stretch>
-                  </pic:blipFill>
-                  <pic:spPr bwMode="auto">
-                    <a:xfrm>
-                      <a:off x="0" y="0"/>
-                      <a:ext cx="5731510" cy="3700780"/>
-                    </a:xfrm>
-                    <a:prstGeom prst="rect">
-                      <a:avLst/>
-                    </a:prstGeom>
-                    <a:noFill/>
-                    <a:ln>
-                      <a:noFill/>
-                    </a:ln>
-                  </pic:spPr>
-                </pic:pic>
-              </a:graphicData>
-            </a:graphic>
-          </wp:inline>
-        </w:drawing>
-      </w:r>
-    </w:p>
+    <w:p/>
     <w:p>
       <w:pPr>
         <w:pStyle w:val="Heading2"/>
@@ -484,13 +442,11 @@
       <w:r>
         <w:t xml:space="preserve">3 to 4 </w:t>
       </w:r>
-      <w:proofErr w:type="spellStart"/>
-      <w:r>
-        <w:t>cms</w:t>
-      </w:r>
-      <w:proofErr w:type="spellEnd"/>
-      <w:r>
-        <w:t xml:space="preserve"> in length</w:t>
+      <w:r>
+        <w:t xml:space="preserve">cm </w:t>
+      </w:r>
+      <w:r>
+        <w:t>in length</w:t>
       </w:r>
     </w:p>
     <w:p>
@@ -544,11 +500,9 @@
       <w:r>
         <w:t xml:space="preserve">The entry is </w:t>
       </w:r>
-      <w:proofErr w:type="spellStart"/>
-      <w:r>
-        <w:t>gaurded</w:t>
-      </w:r>
-      <w:proofErr w:type="spellEnd"/>
+      <w:r>
+        <w:t>guarded</w:t>
+      </w:r>
       <w:r>
         <w:t xml:space="preserve"> by sphincter of Oddi</w:t>
       </w:r>
@@ -574,7 +528,9 @@
     </w:p>
     <w:p>
       <w:r>
-        <w:lastRenderedPageBreak/>
+        <w:t>[TIP]</w:t>
+      </w:r>
+      <w:r>
         <w:t>Gall stones may clog in common bile duct (Choledocholithiasis)</w:t>
       </w:r>
     </w:p>
@@ -675,18 +631,33 @@
         </w:numPr>
       </w:pPr>
       <w:r>
+        <w:lastRenderedPageBreak/>
         <w:t>Cystic artery is located in this triangle during laparoscopic cholecystectomy</w:t>
       </w:r>
     </w:p>
     <w:p>
       <w:pPr>
-        <w:numPr>
-          <w:ilvl w:val="0"/>
-          <w:numId w:val="9"/>
-        </w:numPr>
-      </w:pPr>
+        <w:ind w:left="360"/>
+      </w:pPr>
+      <w:r>
+        <w:t>[WARNING]</w:t>
+      </w:r>
       <w:r>
         <w:t>Dissection in the triangle of Calot is the most common cause of common bile duct injuries. Dissection in the triangle is not advised until the cystic duct is definitively identified. </w:t>
+      </w:r>
+    </w:p>
+    <w:p>
+      <w:r>
+        <w:t>[HTML]</w:t>
+      </w:r>
+      <w:r>
+        <w:t xml:space="preserve"> </w:t>
+      </w:r>
+      <w:r>
+        <w:t>calots.html</w:t>
+      </w:r>
+      <w:r>
+        <w:t>[/HTML]</w:t>
       </w:r>
     </w:p>
     <w:p>
@@ -746,6 +717,339 @@
     <w:p>
       <w:r>
         <w:t>Branch of right hepatic artery</w:t>
+      </w:r>
+    </w:p>
+    <w:p>
+      <w:r>
+        <w:t>[SVG]</w:t>
+      </w:r>
+      <w:r>
+        <w:t xml:space="preserve"> </w:t>
+      </w:r>
+      <w:r>
+        <w:t>blood%20supply%20of%20gall%20bladder.svg</w:t>
+      </w:r>
+      <w:r>
+        <w:t>[/SVG]</w:t>
+      </w:r>
+    </w:p>
+    <w:p>
+      <w:r>
+        <w:rPr>
+          <w:b/>
+          <w:bCs/>
+          <w:i/>
+          <w:iCs/>
+        </w:rPr>
+        <w:t>MCQ_START</w:t>
+      </w:r>
+    </w:p>
+    <w:p>
+      <w:r>
+        <w:t>Q1. The fundus of the gall bladder is surface projected at:</w:t>
+      </w:r>
+      <w:r>
+        <w:br/>
+        <w:t>A. Junction of left midclavicular line and left costal margin</w:t>
+      </w:r>
+      <w:r>
+        <w:br/>
+        <w:t xml:space="preserve">B. Junction of right midclavicular line and right costal </w:t>
+      </w:r>
+      <w:proofErr w:type="gramStart"/>
+      <w:r>
+        <w:t>margin[</w:t>
+      </w:r>
+      <w:proofErr w:type="gramEnd"/>
+      <w:r>
+        <w:t>CORRECT]</w:t>
+      </w:r>
+      <w:r>
+        <w:br/>
+        <w:t>C. Midpoint of inguinal ligament</w:t>
+      </w:r>
+      <w:r>
+        <w:br/>
+        <w:t xml:space="preserve">D. Epigastric region at the </w:t>
+      </w:r>
+      <w:proofErr w:type="spellStart"/>
+      <w:r>
+        <w:t>xiphisternal</w:t>
+      </w:r>
+      <w:proofErr w:type="spellEnd"/>
+      <w:r>
+        <w:t xml:space="preserve"> junction</w:t>
+      </w:r>
+    </w:p>
+    <w:p>
+      <w:r>
+        <w:pict w14:anchorId="5322D7E5">
+          <v:rect id="_x0000_i1073" style="width:0;height:1.5pt" o:hralign="center" o:hrstd="t" o:hr="t" fillcolor="#a0a0a0" stroked="f"/>
+        </w:pict>
+      </w:r>
+    </w:p>
+    <w:p>
+      <w:r>
+        <w:t>Q2. The body of the gall bladder differs from the fundus because it:</w:t>
+      </w:r>
+      <w:r>
+        <w:br/>
+        <w:t>A. Is completely covered by peritoneum</w:t>
+      </w:r>
+      <w:r>
+        <w:br/>
+        <w:t>B. Lies free in the peritoneal cavity</w:t>
+      </w:r>
+      <w:r>
+        <w:br/>
+        <w:t xml:space="preserve">C. Has no peritoneal covering on its superior surface and is directly related to liver </w:t>
+      </w:r>
+      <w:proofErr w:type="gramStart"/>
+      <w:r>
+        <w:t>parenchyma[</w:t>
+      </w:r>
+      <w:proofErr w:type="gramEnd"/>
+      <w:r>
+        <w:t>CORRECT]</w:t>
+      </w:r>
+      <w:r>
+        <w:br/>
+        <w:t>D. Is related only to the anterior abdominal wall</w:t>
+      </w:r>
+    </w:p>
+    <w:p>
+      <w:r>
+        <w:pict w14:anchorId="7AC15144">
+          <v:rect id="_x0000_i1074" style="width:0;height:1.5pt" o:hralign="center" o:hrstd="t" o:hr="t" fillcolor="#a0a0a0" stroked="f"/>
+        </w:pict>
+      </w:r>
+    </w:p>
+    <w:p>
+      <w:r>
+        <w:t>Q3. Hartmann’s pouch is best described as:</w:t>
+      </w:r>
+      <w:r>
+        <w:br/>
+        <w:t>A. A congenital diverticulum of the fundus</w:t>
+      </w:r>
+      <w:r>
+        <w:br/>
+        <w:t>B. Dilatation of the common hepatic duct</w:t>
+      </w:r>
+      <w:r>
+        <w:br/>
+        <w:t xml:space="preserve">C. Dilated posteromedial wall of the neck at the junction of neck and cystic </w:t>
+      </w:r>
+      <w:proofErr w:type="gramStart"/>
+      <w:r>
+        <w:lastRenderedPageBreak/>
+        <w:t>duct[</w:t>
+      </w:r>
+      <w:proofErr w:type="gramEnd"/>
+      <w:r>
+        <w:t>CORRECT]</w:t>
+      </w:r>
+      <w:r>
+        <w:br/>
+        <w:t>D. Terminal expansion of the common bile duct</w:t>
+      </w:r>
+    </w:p>
+    <w:p>
+      <w:r>
+        <w:pict w14:anchorId="65579F2D">
+          <v:rect id="_x0000_i1075" style="width:0;height:1.5pt" o:hralign="center" o:hrstd="t" o:hr="t" fillcolor="#a0a0a0" stroked="f"/>
+        </w:pict>
+      </w:r>
+    </w:p>
+    <w:p>
+      <w:r>
+        <w:t>Q4. The cystic duct joins the common hepatic duct to form the:</w:t>
+      </w:r>
+      <w:r>
+        <w:br/>
+        <w:t>A. Hepatic duct</w:t>
+      </w:r>
+      <w:r>
+        <w:br/>
+        <w:t>B. Pancreatic duct</w:t>
+      </w:r>
+      <w:r>
+        <w:br/>
+        <w:t xml:space="preserve">C. Common bile </w:t>
+      </w:r>
+      <w:proofErr w:type="gramStart"/>
+      <w:r>
+        <w:t>duct[</w:t>
+      </w:r>
+      <w:proofErr w:type="gramEnd"/>
+      <w:r>
+        <w:t>CORRECT]</w:t>
+      </w:r>
+      <w:r>
+        <w:br/>
+        <w:t>D. Accessory bile duct</w:t>
+      </w:r>
+    </w:p>
+    <w:p>
+      <w:r>
+        <w:pict w14:anchorId="6D827CC1">
+          <v:rect id="_x0000_i1076" style="width:0;height:1.5pt" o:hralign="center" o:hrstd="t" o:hr="t" fillcolor="#a0a0a0" stroked="f"/>
+        </w:pict>
+      </w:r>
+    </w:p>
+    <w:p>
+      <w:r>
+        <w:t>Q5. The common bile duct usually drains into the:</w:t>
+      </w:r>
+      <w:r>
+        <w:br/>
+        <w:t>A. First part of duodenum</w:t>
+      </w:r>
+      <w:r>
+        <w:br/>
+        <w:t xml:space="preserve">B. Second part of duodenum at the major duodenal </w:t>
+      </w:r>
+      <w:proofErr w:type="gramStart"/>
+      <w:r>
+        <w:t>papilla[</w:t>
+      </w:r>
+      <w:proofErr w:type="gramEnd"/>
+      <w:r>
+        <w:t>CORRECT]</w:t>
+      </w:r>
+      <w:r>
+        <w:br/>
+        <w:t>C. Third part of duodenum</w:t>
+      </w:r>
+      <w:r>
+        <w:br/>
+        <w:t>D. Jejunum</w:t>
+      </w:r>
+    </w:p>
+    <w:p>
+      <w:r>
+        <w:pict w14:anchorId="41F8D82C">
+          <v:rect id="_x0000_i1077" style="width:0;height:1.5pt" o:hralign="center" o:hrstd="t" o:hr="t" fillcolor="#a0a0a0" stroked="f"/>
+        </w:pict>
+      </w:r>
+    </w:p>
+    <w:p>
+      <w:r>
+        <w:t>Q6. The boundaries of Calot’s (cystohepatic) triangle include all EXCEPT:</w:t>
+      </w:r>
+      <w:r>
+        <w:br/>
+        <w:t>A. Cystic duct</w:t>
+      </w:r>
+      <w:r>
+        <w:br/>
+        <w:t>B. Common hepatic duct</w:t>
+      </w:r>
+      <w:r>
+        <w:br/>
+        <w:t>C. Inferior surface of liver</w:t>
+      </w:r>
+      <w:r>
+        <w:br/>
+        <w:t xml:space="preserve">D. Right hepatic </w:t>
+      </w:r>
+      <w:proofErr w:type="gramStart"/>
+      <w:r>
+        <w:t>vein[</w:t>
+      </w:r>
+      <w:proofErr w:type="gramEnd"/>
+      <w:r>
+        <w:t>CORRECT]</w:t>
+      </w:r>
+    </w:p>
+    <w:p>
+      <w:r>
+        <w:pict w14:anchorId="0289E4BB">
+          <v:rect id="_x0000_i1078" style="width:0;height:1.5pt" o:hralign="center" o:hrstd="t" o:hr="t" fillcolor="#a0a0a0" stroked="f"/>
+        </w:pict>
+      </w:r>
+    </w:p>
+    <w:p>
+      <w:r>
+        <w:t>Q7. The arterial supply of the gall bladder is mainly from:</w:t>
+      </w:r>
+      <w:r>
+        <w:br/>
+        <w:t>A. Proper hepatic artery</w:t>
+      </w:r>
+      <w:r>
+        <w:br/>
+        <w:t>B. Left hepatic artery</w:t>
+      </w:r>
+      <w:r>
+        <w:br/>
+        <w:t xml:space="preserve">C. Cystic artery, a branch of right hepatic </w:t>
+      </w:r>
+      <w:proofErr w:type="gramStart"/>
+      <w:r>
+        <w:t>artery[</w:t>
+      </w:r>
+      <w:proofErr w:type="gramEnd"/>
+      <w:r>
+        <w:t>CORRECT]</w:t>
+      </w:r>
+      <w:r>
+        <w:br/>
+        <w:t>D. Gastroduodenal artery</w:t>
+      </w:r>
+    </w:p>
+    <w:p>
+      <w:r>
+        <w:pict w14:anchorId="7F189E1D">
+          <v:rect id="_x0000_i1079" style="width:0;height:1.5pt" o:hralign="center" o:hrstd="t" o:hr="t" fillcolor="#a0a0a0" stroked="f"/>
+        </w:pict>
+      </w:r>
+    </w:p>
+    <w:p>
+      <w:r>
+        <w:t>Q8. The cystic plate refers to:</w:t>
+      </w:r>
+      <w:r>
+        <w:br/>
+        <w:t>A. Spiral mucosal folds in the cystic duct</w:t>
+      </w:r>
+      <w:r>
+        <w:br/>
+        <w:t xml:space="preserve">B. Liver bed of the gall bladder in the gallbladder </w:t>
+      </w:r>
+      <w:proofErr w:type="gramStart"/>
+      <w:r>
+        <w:t>fossa[</w:t>
+      </w:r>
+      <w:proofErr w:type="gramEnd"/>
+      <w:r>
+        <w:t>CORRECT]</w:t>
+      </w:r>
+      <w:r>
+        <w:br/>
+        <w:t>C. Peritoneal fold over the fundus</w:t>
+      </w:r>
+      <w:r>
+        <w:br/>
+        <w:t>D. Posterior wall of Calot’s triangle</w:t>
+      </w:r>
+    </w:p>
+    <w:p>
+      <w:r>
+        <w:pict w14:anchorId="6E76C9FA">
+          <v:rect id="_x0000_i1080" style="width:0;height:1.5pt" o:hralign="center" o:hrstd="t" o:hr="t" fillcolor="#a0a0a0" stroked="f"/>
+        </w:pict>
+      </w:r>
+    </w:p>
+    <w:p>
+      <w:r>
+        <w:rPr>
+          <w:b/>
+          <w:bCs/>
+          <w:i/>
+          <w:iCs/>
+        </w:rPr>
+        <w:t>MCQ_END</w:t>
       </w:r>
     </w:p>
     <w:p/>

</xml_diff>